<commit_message>
Route inquiries and published contact details to the new Gmail address
</commit_message>
<xml_diff>
--- a/business/optional-update-support.docx
+++ b/business/optional-update-support.docx
@@ -367,7 +367,7 @@
               <w:rPr>
                 <w:sz w:val="18"/>
               </w:rPr>
-              <w:t>eyu.eyu0806@gmail.com</w:t>
+              <w:t>yue.sadamatsu@gmail.com</w:t>
             </w:r>
           </w:p>
         </w:tc>
@@ -617,7 +617,7 @@
               <w:rPr>
                 <w:sz w:val="18"/>
               </w:rPr>
-              <w:t>当月末までに eyu.eyu0806@gmail.com へメール連絡、翌月から終了。</w:t>
+              <w:t>当月末までに yue.sadamatsu@gmail.com へメール連絡、翌月から終了。</w:t>
             </w:r>
           </w:p>
         </w:tc>

</xml_diff>